<commit_message>
docs: line up the admin login and FR numbers with the code
- Name the seeded admin "Tech Project" in `scripts/seed.mjs`, so the account matches the real inbox it uses
- Point `.env.example` and the README's admin line at the email in the seed, instead of the wrong `admin@demo.test`
- Fix the FR numbers on the admin content, plan layout and PDF report comments, and drop the notice's stale FR-12
- Say `@react-pdf/renderer` in the README stack and note in `openai.js` that `gpt-6-luna` is the free-plan model
</commit_message>
<xml_diff>
--- a/docs/Project-Documentation.docx
+++ b/docs/Project-Documentation.docx
@@ -13221,7 +13221,7 @@
           <w:szCs w:val="24"/>
           <w:lang w:val="en-GB"/>
         </w:rPr>
-        <w:t>Let founders share a plan with approved funders, who can send interest and message the owner.</w:t>
+        <w:t xml:space="preserve">Let founders share a plan with approved funders, who can send interest and, once accepted, read the plan and message the owner.</w:t>
       </w:r>
     </w:p>
     <w:p>
@@ -16969,7 +16969,7 @@
                 <w:szCs w:val="20"/>
                 <w:lang w:val="en-GB"/>
               </w:rPr>
-              <w:t xml:space="preserve">Fixes, switching on the </w:t>
+              <w:t xml:space="preserve">Fixes, checking fees and sources, paid hosting</w:t>
             </w:r>
             <w:r>
               <w:rPr>
@@ -16980,17 +16980,17 @@
                 <w:szCs w:val="20"/>
                 <w:lang w:val="en-GB"/>
               </w:rPr>
-              <w:t xml:space="preserve">ChatGPT API, </w:t>
-            </w:r>
-            <w:r>
-              <w:rPr>
-                <w:rFonts w:ascii="Times New Roman" w:eastAsia="Times New Roman" w:hAnsi="Times New Roman" w:cs="Times New Roman"/>
-                <w:color w:val="000000"/>
-                <w:sz w:val="20"/>
-                <w:szCs w:val="20"/>
-                <w:lang w:val="en-GB"/>
-              </w:rPr>
-              <w:t>paid hosting</w:t>
+              <w:t xml:space="preserve"/>
+            </w:r>
+            <w:r>
+              <w:rPr>
+                <w:rFonts w:ascii="Times New Roman" w:eastAsia="Times New Roman" w:hAnsi="Times New Roman" w:cs="Times New Roman"/>
+                <w:color w:val="000000"/>
+                <w:sz w:val="20"/>
+                <w:szCs w:val="20"/>
+                <w:lang w:val="en-GB"/>
+              </w:rPr>
+              <w:t xml:space="preserve"/>
             </w:r>
           </w:p>
         </w:tc>
@@ -18216,27 +18216,27 @@
           <w:szCs w:val="24"/>
           <w:lang w:val="en-GB"/>
         </w:rPr>
-        <w:t xml:space="preserve">method [15]: Must, Should, Could or Won’t have. Must items </w:t>
-      </w:r>
-      <w:r>
-        <w:rPr>
-          <w:rFonts w:ascii="Times New Roman" w:eastAsia="Times New Roman" w:hAnsi="Times New Roman" w:cs="Times New Roman"/>
-          <w:color w:val="000000"/>
-          <w:sz w:val="24"/>
-          <w:szCs w:val="24"/>
-          <w:lang w:val="en-GB"/>
-        </w:rPr>
-        <w:t>be</w:t>
-      </w:r>
-      <w:r>
-        <w:rPr>
-          <w:rFonts w:ascii="Times New Roman" w:eastAsia="Times New Roman" w:hAnsi="Times New Roman" w:cs="Times New Roman"/>
-          <w:color w:val="000000"/>
-          <w:sz w:val="24"/>
-          <w:szCs w:val="24"/>
-          <w:lang w:val="en-GB"/>
-        </w:rPr>
-        <w:t xml:space="preserve"> essential for the first release; Should items can move to later work.</w:t>
+        <w:t xml:space="preserve">method [15]: Must, Should, Could or Won’t have. Must items are essential for the first release</w:t>
+      </w:r>
+      <w:r>
+        <w:rPr>
+          <w:rFonts w:ascii="Times New Roman" w:eastAsia="Times New Roman" w:hAnsi="Times New Roman" w:cs="Times New Roman"/>
+          <w:color w:val="000000"/>
+          <w:sz w:val="24"/>
+          <w:szCs w:val="24"/>
+          <w:lang w:val="en-GB"/>
+        </w:rPr>
+        <w:t xml:space="preserve"/>
+      </w:r>
+      <w:r>
+        <w:rPr>
+          <w:rFonts w:ascii="Times New Roman" w:eastAsia="Times New Roman" w:hAnsi="Times New Roman" w:cs="Times New Roman"/>
+          <w:color w:val="000000"/>
+          <w:sz w:val="24"/>
+          <w:szCs w:val="24"/>
+          <w:lang w:val="en-GB"/>
+        </w:rPr>
+        <w:t xml:space="preserve">; Should items can move to later work.</w:t>
       </w:r>
     </w:p>
     <w:p>
@@ -23152,7 +23152,7 @@
           <w:szCs w:val="24"/>
           <w:lang w:val="en-GB"/>
         </w:rPr>
-        <w:t xml:space="preserve">and nothing needs to be bought except the optional </w:t>
+        <w:t xml:space="preserve">and nothing needs to be bought: even the optional ChatGPT API works on OpenAI’s free plan.</w:t>
       </w:r>
       <w:r>
         <w:rPr>
@@ -23163,7 +23163,7 @@
           <w:szCs w:val="24"/>
           <w:lang w:val="en-GB"/>
         </w:rPr>
-        <w:t xml:space="preserve">ChatGPT API. </w:t>
+        <w:t xml:space="preserve"> </w:t>
       </w:r>
       <w:r>
         <w:rPr>
@@ -24150,17 +24150,17 @@
                 <w:szCs w:val="20"/>
                 <w:lang w:val="en-GB"/>
               </w:rPr>
-              <w:t xml:space="preserve">ChatGPT </w:t>
-            </w:r>
-            <w:r>
-              <w:rPr>
-                <w:rFonts w:ascii="Times New Roman" w:eastAsia="Times New Roman" w:hAnsi="Times New Roman" w:cs="Times New Roman"/>
-                <w:color w:val="000000"/>
-                <w:sz w:val="20"/>
-                <w:szCs w:val="20"/>
-                <w:lang w:val="en-GB"/>
-              </w:rPr>
-              <w:t xml:space="preserve">writes </w:t>
+              <w:t xml:space="preserve">ChatGPT (gpt-6-luna by default) writes roadmaps and answers when a key is set</w:t>
+            </w:r>
+            <w:r>
+              <w:rPr>
+                <w:rFonts w:ascii="Times New Roman" w:eastAsia="Times New Roman" w:hAnsi="Times New Roman" w:cs="Times New Roman"/>
+                <w:color w:val="000000"/>
+                <w:sz w:val="20"/>
+                <w:szCs w:val="20"/>
+                <w:lang w:val="en-GB"/>
+              </w:rPr>
+              <w:t xml:space="preserve"/>
             </w:r>
             <w:r>
               <w:rPr>
@@ -24171,17 +24171,17 @@
                 <w:szCs w:val="20"/>
                 <w:lang w:val="en-GB"/>
               </w:rPr>
-              <w:t xml:space="preserve">roadmaps </w:t>
-            </w:r>
-            <w:r>
-              <w:rPr>
-                <w:rFonts w:ascii="Times New Roman" w:eastAsia="Times New Roman" w:hAnsi="Times New Roman" w:cs="Times New Roman"/>
-                <w:color w:val="000000"/>
-                <w:sz w:val="20"/>
-                <w:szCs w:val="20"/>
-                <w:lang w:val="en-GB"/>
-              </w:rPr>
-              <w:t>and answers when a key is set</w:t>
+              <w:t xml:space="preserve"/>
+            </w:r>
+            <w:r>
+              <w:rPr>
+                <w:rFonts w:ascii="Times New Roman" w:eastAsia="Times New Roman" w:hAnsi="Times New Roman" w:cs="Times New Roman"/>
+                <w:color w:val="000000"/>
+                <w:sz w:val="20"/>
+                <w:szCs w:val="20"/>
+                <w:lang w:val="en-GB"/>
+              </w:rPr>
+              <w:t xml:space="preserve"/>
             </w:r>
           </w:p>
         </w:tc>
@@ -28849,7 +28849,7 @@
           <w:szCs w:val="24"/>
           <w:lang w:val="en-GB"/>
         </w:rPr>
-        <w:t>UAE Venture Guide gives each founder a personal plan built from official sources, and a place to track it and get help. Mentors and funders join after the administrator approves them. A plan stays private, apart from the administrator, until a mentor accepts a request that has the plan attached, or the founder accepts a funder’s interest.</w:t>
+        <w:t xml:space="preserve">UAE Venture Guide gives each founder a personal plan built from official sources, and a place to track it and get help. Mentors and funders join after the administrator approves them. A plan stays private, apart from the administrator, until a mentor accepts a request that has the plan attached, or the founder accepts a funder’s interest. Sharing a plan shows funders only a short pitch card.</w:t>
       </w:r>
     </w:p>
     <w:p>
@@ -31988,17 +31988,17 @@
           <w:szCs w:val="24"/>
           <w:lang w:val="en-GB"/>
         </w:rPr>
-        <w:t xml:space="preserve">MongoDB </w:t>
-      </w:r>
-      <w:r>
-        <w:rPr>
-          <w:rFonts w:ascii="Times New Roman" w:eastAsia="Times New Roman" w:hAnsi="Times New Roman" w:cs="Times New Roman"/>
-          <w:color w:val="000000"/>
-          <w:sz w:val="24"/>
-          <w:szCs w:val="24"/>
-          <w:lang w:val="en-GB"/>
-        </w:rPr>
-        <w:t>deletes a sign-in record 15 minutes after the last counted try, and usage records after 180 days.</w:t>
+        <w:t xml:space="preserve">MongoDB deletes a sign-in record when its 15 minutes run out (tries during a lock do not extend them), and usage records after 180 days.</w:t>
+      </w:r>
+      <w:r>
+        <w:rPr>
+          <w:rFonts w:ascii="Times New Roman" w:eastAsia="Times New Roman" w:hAnsi="Times New Roman" w:cs="Times New Roman"/>
+          <w:color w:val="000000"/>
+          <w:sz w:val="24"/>
+          <w:szCs w:val="24"/>
+          <w:lang w:val="en-GB"/>
+        </w:rPr>
+        <w:t xml:space="preserve"/>
       </w:r>
     </w:p>
     <w:p>
@@ -39547,7 +39547,7 @@
           <w:szCs w:val="24"/>
           <w:lang w:val="en-GB"/>
         </w:rPr>
-        <w:t xml:space="preserve">the optional </w:t>
+        <w:t xml:space="preserve">the optional OpenAI key and model (OPENAI_API_KEY, OPENAI_MODEL), optional email settings, and the administrator’s email and password for the seed script (ADMIN_EMAIL, ADMIN_PASSWORD). Without the OpenAI key, the app runs in sample mode.</w:t>
       </w:r>
       <w:r>
         <w:rPr>
@@ -39558,17 +39558,17 @@
           <w:szCs w:val="24"/>
           <w:lang w:val="en-GB"/>
         </w:rPr>
-        <w:t xml:space="preserve">OpenAI </w:t>
-      </w:r>
-      <w:r>
-        <w:rPr>
-          <w:rFonts w:ascii="Times New Roman" w:eastAsia="Times New Roman" w:hAnsi="Times New Roman" w:cs="Times New Roman"/>
-          <w:color w:val="000000"/>
-          <w:sz w:val="24"/>
-          <w:szCs w:val="24"/>
-          <w:lang w:val="en-GB"/>
-        </w:rPr>
-        <w:t xml:space="preserve">key and model </w:t>
+        <w:t xml:space="preserve"/>
+      </w:r>
+      <w:r>
+        <w:rPr>
+          <w:rFonts w:ascii="Times New Roman" w:eastAsia="Times New Roman" w:hAnsi="Times New Roman" w:cs="Times New Roman"/>
+          <w:color w:val="000000"/>
+          <w:sz w:val="24"/>
+          <w:szCs w:val="24"/>
+          <w:lang w:val="en-GB"/>
+        </w:rPr>
+        <w:t xml:space="preserve"/>
       </w:r>
       <w:r>
         <w:rPr>
@@ -39579,17 +39579,17 @@
           <w:szCs w:val="24"/>
           <w:lang w:val="en-GB"/>
         </w:rPr>
-        <w:t xml:space="preserve">(OPENAI_API_KEY, OPENAI_MODEL) </w:t>
-      </w:r>
-      <w:r>
-        <w:rPr>
-          <w:rFonts w:ascii="Times New Roman" w:eastAsia="Times New Roman" w:hAnsi="Times New Roman" w:cs="Times New Roman"/>
-          <w:color w:val="000000"/>
-          <w:sz w:val="24"/>
-          <w:szCs w:val="24"/>
-          <w:lang w:val="en-GB"/>
-        </w:rPr>
-        <w:t xml:space="preserve">and optional email settings. Without the key, the app runs in sample mode. A template file </w:t>
+        <w:t xml:space="preserve"/>
+      </w:r>
+      <w:r>
+        <w:rPr>
+          <w:rFonts w:ascii="Times New Roman" w:eastAsia="Times New Roman" w:hAnsi="Times New Roman" w:cs="Times New Roman"/>
+          <w:color w:val="000000"/>
+          <w:sz w:val="24"/>
+          <w:szCs w:val="24"/>
+          <w:lang w:val="en-GB"/>
+        </w:rPr>
+        <w:t xml:space="preserve"> A template file </w:t>
       </w:r>
       <w:r>
         <w:rPr>
@@ -45953,7 +45953,7 @@
           <w:szCs w:val="24"/>
           <w:lang w:val="en-GB"/>
         </w:rPr>
-        <w:t xml:space="preserve">No load or response-time tests were run. The design choices below aim to keep pages fast: pages are built on the server, so the browser downloads less code; database queries use indexes on the </w:t>
+        <w:t xml:space="preserve">No load tests were run. In a live test with an OpenAI key, ChatGPT wrote a roadmap in about 40 to 50 seconds, and a chat answer began within a few seconds. The design choices below aim to keep pages fast: pages are built on the server, so the browser downloads less code; database queries use indexes on the </w:t>
       </w:r>
       <w:r>
         <w:rPr>
@@ -49110,7 +49110,7 @@
           <w:szCs w:val="24"/>
           <w:lang w:val="en-GB"/>
         </w:rPr>
-        <w:t xml:space="preserve">key, the planner and assistant use built-in rules, so answers are limited to known topics. The </w:t>
+        <w:t xml:space="preserve">key, the planner and assistant use built-in rules, so answers are limited to known topics. The automated tests use a stand-in for the ChatGPT API, and the live path has so far been tried only on a demo plan.</w:t>
       </w:r>
       <w:r>
         <w:rPr>
@@ -49121,17 +49121,17 @@
           <w:szCs w:val="24"/>
           <w:lang w:val="en-GB"/>
         </w:rPr>
-        <w:t xml:space="preserve">ChatGPT </w:t>
-      </w:r>
-      <w:r>
-        <w:rPr>
-          <w:rFonts w:ascii="Times New Roman" w:eastAsia="Times New Roman" w:hAnsi="Times New Roman" w:cs="Times New Roman"/>
-          <w:color w:val="000000"/>
-          <w:sz w:val="24"/>
-          <w:szCs w:val="24"/>
-          <w:lang w:val="en-GB"/>
-        </w:rPr>
-        <w:t xml:space="preserve">path is tested with a stand-in for the </w:t>
+        <w:t xml:space="preserve"/>
+      </w:r>
+      <w:r>
+        <w:rPr>
+          <w:rFonts w:ascii="Times New Roman" w:eastAsia="Times New Roman" w:hAnsi="Times New Roman" w:cs="Times New Roman"/>
+          <w:color w:val="000000"/>
+          <w:sz w:val="24"/>
+          <w:szCs w:val="24"/>
+          <w:lang w:val="en-GB"/>
+        </w:rPr>
+        <w:t xml:space="preserve"/>
       </w:r>
       <w:r>
         <w:rPr>
@@ -49142,17 +49142,17 @@
           <w:szCs w:val="24"/>
           <w:lang w:val="en-GB"/>
         </w:rPr>
-        <w:t xml:space="preserve">API, </w:t>
-      </w:r>
-      <w:r>
-        <w:rPr>
-          <w:rFonts w:ascii="Times New Roman" w:eastAsia="Times New Roman" w:hAnsi="Times New Roman" w:cs="Times New Roman"/>
-          <w:color w:val="000000"/>
-          <w:sz w:val="24"/>
-          <w:szCs w:val="24"/>
-          <w:lang w:val="en-GB"/>
-        </w:rPr>
-        <w:t>not yet with live calls.</w:t>
+        <w:t xml:space="preserve"/>
+      </w:r>
+      <w:r>
+        <w:rPr>
+          <w:rFonts w:ascii="Times New Roman" w:eastAsia="Times New Roman" w:hAnsi="Times New Roman" w:cs="Times New Roman"/>
+          <w:color w:val="000000"/>
+          <w:sz w:val="24"/>
+          <w:szCs w:val="24"/>
+          <w:lang w:val="en-GB"/>
+        </w:rPr>
+        <w:t xml:space="preserve"/>
       </w:r>
     </w:p>
     <w:p>
@@ -49262,7 +49262,7 @@
           <w:szCs w:val="24"/>
           <w:lang w:val="en-GB"/>
         </w:rPr>
-        <w:t xml:space="preserve">Add an </w:t>
+        <w:t xml:space="preserve">Review ChatGPT’s roadmaps and answers on more sample plans, and compare a larger model, which needs paid OpenAI credit.</w:t>
       </w:r>
       <w:r>
         <w:rPr>
@@ -49273,17 +49273,17 @@
           <w:szCs w:val="24"/>
           <w:lang w:val="en-GB"/>
         </w:rPr>
-        <w:t xml:space="preserve">OpenAI API </w:t>
-      </w:r>
-      <w:r>
-        <w:rPr>
-          <w:rFonts w:ascii="Times New Roman" w:eastAsia="Times New Roman" w:hAnsi="Times New Roman" w:cs="Times New Roman"/>
-          <w:color w:val="000000"/>
-          <w:sz w:val="24"/>
-          <w:szCs w:val="24"/>
-          <w:lang w:val="en-GB"/>
-        </w:rPr>
-        <w:t xml:space="preserve">key and review </w:t>
+        <w:t xml:space="preserve"/>
+      </w:r>
+      <w:r>
+        <w:rPr>
+          <w:rFonts w:ascii="Times New Roman" w:eastAsia="Times New Roman" w:hAnsi="Times New Roman" w:cs="Times New Roman"/>
+          <w:color w:val="000000"/>
+          <w:sz w:val="24"/>
+          <w:szCs w:val="24"/>
+          <w:lang w:val="en-GB"/>
+        </w:rPr>
+        <w:t xml:space="preserve"/>
       </w:r>
       <w:r>
         <w:rPr>
@@ -49294,17 +49294,17 @@
           <w:szCs w:val="24"/>
           <w:lang w:val="en-GB"/>
         </w:rPr>
-        <w:t xml:space="preserve">ChatGPT’s roadmaps </w:t>
-      </w:r>
-      <w:r>
-        <w:rPr>
-          <w:rFonts w:ascii="Times New Roman" w:eastAsia="Times New Roman" w:hAnsi="Times New Roman" w:cs="Times New Roman"/>
-          <w:color w:val="000000"/>
-          <w:sz w:val="24"/>
-          <w:szCs w:val="24"/>
-          <w:lang w:val="en-GB"/>
-        </w:rPr>
-        <w:t>and answers on sample plans.</w:t>
+        <w:t xml:space="preserve"/>
+      </w:r>
+      <w:r>
+        <w:rPr>
+          <w:rFonts w:ascii="Times New Roman" w:eastAsia="Times New Roman" w:hAnsi="Times New Roman" w:cs="Times New Roman"/>
+          <w:color w:val="000000"/>
+          <w:sz w:val="24"/>
+          <w:szCs w:val="24"/>
+          <w:lang w:val="en-GB"/>
+        </w:rPr>
+        <w:t xml:space="preserve"/>
       </w:r>
     </w:p>
     <w:p>
@@ -50744,7 +50744,7 @@
           <w:szCs w:val="24"/>
           <w:lang w:val="en-GB"/>
         </w:rPr>
-        <w:t>creates nine demo accounts: one administrator, two entrepreneurs, four mentors (one waiting for approval) and two funders (one waiting for approval). It also adds 13 sample sources, 15 sample fee references, two plans, three posts, two guidance requests and two funding interests. All demo accounts share one password, given in the README.</w:t>
+        <w:t xml:space="preserve">creates nine accounts: one administrator, two entrepreneurs, four mentors (one waiting for approval) and two funders (one waiting for approval). It also adds 13 sample sources, 15 sample fee references, two plans, three posts, two guidance requests and two funding interests. The administrator’s email and password come from ADMIN_EMAIL and ADMIN_PASSWORD; the other accounts share one demo password, given in the README.</w:t>
       </w:r>
     </w:p>
     <w:p>

</xml_diff>

<commit_message>
ci: drop the GitHub Actions check workflow
- Delete `.github/workflows/check.yml`, since the lint and build run locally and CI isn't part of the hand-in
- Remove the workflow's throwaway MongoDB service and `MONGODB_URI`/`JWT_SECRET` stand-ins with it
- Update `docs/Project-Documentation.docx` to match the current state of the repo
</commit_message>
<xml_diff>
--- a/docs/Project-Documentation.docx
+++ b/docs/Project-Documentation.docx
@@ -1998,66 +1998,6 @@
                 <w:szCs w:val="20"/>
                 <w:lang w:val="en-GB"/>
               </w:rPr>
-              <w:t>CI</w:t>
-            </w:r>
-          </w:p>
-        </w:tc>
-        <w:tc>
-          <w:tcPr>
-            <w:tcW w:w="7160" w:type="dxa"/>
-          </w:tcPr>
-          <w:p>
-            <w:pPr>
-              <w:spacing w:before="40" w:after="40"/>
-              <w:rPr>
-                <w:rFonts w:ascii="Times New Roman" w:eastAsia="Times New Roman" w:hAnsi="Times New Roman" w:cs="Times New Roman"/>
-                <w:color w:val="000000"/>
-                <w:sz w:val="20"/>
-                <w:szCs w:val="20"/>
-                <w:lang w:val="en-GB"/>
-              </w:rPr>
-            </w:pPr>
-            <w:r>
-              <w:rPr>
-                <w:rFonts w:ascii="Times New Roman" w:eastAsia="Times New Roman" w:hAnsi="Times New Roman" w:cs="Times New Roman"/>
-                <w:color w:val="000000"/>
-                <w:sz w:val="20"/>
-                <w:szCs w:val="20"/>
-                <w:lang w:val="en-GB"/>
-              </w:rPr>
-              <w:t>Continuous Integration</w:t>
-            </w:r>
-          </w:p>
-        </w:tc>
-      </w:tr>
-      <w:tr>
-        <w:trPr>
-          <w:cantSplit/>
-        </w:trPr>
-        <w:tc>
-          <w:tcPr>
-            <w:tcW w:w="2200" w:type="dxa"/>
-          </w:tcPr>
-          <w:p>
-            <w:pPr>
-              <w:spacing w:before="40" w:after="40"/>
-              <w:rPr>
-                <w:rFonts w:ascii="Times New Roman" w:eastAsia="Times New Roman" w:hAnsi="Times New Roman" w:cs="Times New Roman"/>
-                <w:color w:val="000000"/>
-                <w:sz w:val="20"/>
-                <w:szCs w:val="20"/>
-                <w:lang w:val="en-GB"/>
-              </w:rPr>
-            </w:pPr>
-            <w:r>
-              <w:rPr>
-                <w:rFonts w:ascii="Times New Roman" w:eastAsia="Times New Roman" w:hAnsi="Times New Roman" w:cs="Times New Roman"/>
-                <w:noProof/>
-                <w:color w:val="000000"/>
-                <w:sz w:val="20"/>
-                <w:szCs w:val="20"/>
-                <w:lang w:val="en-GB"/>
-              </w:rPr>
               <w:t>CSRF</w:t>
             </w:r>
           </w:p>
@@ -22913,7 +22853,7 @@
                 <w:szCs w:val="20"/>
                 <w:lang w:val="en-GB"/>
               </w:rPr>
-              <w:t>The code has a clear folder structure, follows the coding standards and is checked automatically on every change.</w:t>
+              <w:t xml:space="preserve">The code has a clear folder structure, follows the coding standards and is checked with ESLint and the automated tests.</w:t>
             </w:r>
           </w:p>
         </w:tc>
@@ -24322,76 +24262,6 @@
                 <w:lang w:val="en-GB"/>
               </w:rPr>
               <w:t>Code editor and version control</w:t>
-            </w:r>
-          </w:p>
-        </w:tc>
-      </w:tr>
-      <w:tr>
-        <w:trPr>
-          <w:cantSplit/>
-        </w:trPr>
-        <w:tc>
-          <w:tcPr>
-            <w:tcW w:w="2900" w:type="dxa"/>
-          </w:tcPr>
-          <w:p>
-            <w:pPr>
-              <w:spacing w:before="40" w:after="40"/>
-              <w:rPr>
-                <w:rFonts w:ascii="Times New Roman" w:eastAsia="Times New Roman" w:hAnsi="Times New Roman" w:cs="Times New Roman"/>
-                <w:color w:val="000000"/>
-                <w:sz w:val="20"/>
-                <w:szCs w:val="20"/>
-                <w:lang w:val="en-GB"/>
-              </w:rPr>
-            </w:pPr>
-            <w:r>
-              <w:rPr>
-                <w:rFonts w:ascii="Times New Roman" w:eastAsia="Times New Roman" w:hAnsi="Times New Roman" w:cs="Times New Roman"/>
-                <w:noProof/>
-                <w:color w:val="000000"/>
-                <w:sz w:val="20"/>
-                <w:szCs w:val="20"/>
-                <w:lang w:val="en-GB"/>
-              </w:rPr>
-              <w:t xml:space="preserve">GitHub </w:t>
-            </w:r>
-            <w:r>
-              <w:rPr>
-                <w:rFonts w:ascii="Times New Roman" w:eastAsia="Times New Roman" w:hAnsi="Times New Roman" w:cs="Times New Roman"/>
-                <w:color w:val="000000"/>
-                <w:sz w:val="20"/>
-                <w:szCs w:val="20"/>
-                <w:lang w:val="en-GB"/>
-              </w:rPr>
-              <w:t>Actions</w:t>
-            </w:r>
-          </w:p>
-        </w:tc>
-        <w:tc>
-          <w:tcPr>
-            <w:tcW w:w="6460" w:type="dxa"/>
-          </w:tcPr>
-          <w:p>
-            <w:pPr>
-              <w:spacing w:before="40" w:after="40"/>
-              <w:rPr>
-                <w:rFonts w:ascii="Times New Roman" w:eastAsia="Times New Roman" w:hAnsi="Times New Roman" w:cs="Times New Roman"/>
-                <w:color w:val="000000"/>
-                <w:sz w:val="20"/>
-                <w:szCs w:val="20"/>
-                <w:lang w:val="en-GB"/>
-              </w:rPr>
-            </w:pPr>
-            <w:r>
-              <w:rPr>
-                <w:rFonts w:ascii="Times New Roman" w:eastAsia="Times New Roman" w:hAnsi="Times New Roman" w:cs="Times New Roman"/>
-                <w:color w:val="000000"/>
-                <w:sz w:val="20"/>
-                <w:szCs w:val="20"/>
-                <w:lang w:val="en-GB"/>
-              </w:rPr>
-              <w:t>Automated checks on every change</w:t>
             </w:r>
           </w:p>
         </w:tc>
@@ -31096,7 +30966,7 @@
           <w:szCs w:val="24"/>
           <w:lang w:val="en-GB"/>
         </w:rPr>
-        <w:t xml:space="preserve">Code is pushed to </w:t>
+        <w:t xml:space="preserve">Code is pushed to GitHub and can then be deployed to Vercel.</w:t>
       </w:r>
       <w:r>
         <w:rPr>
@@ -31107,17 +30977,17 @@
           <w:szCs w:val="24"/>
           <w:lang w:val="en-GB"/>
         </w:rPr>
-        <w:t xml:space="preserve">GitHub, </w:t>
-      </w:r>
-      <w:r>
-        <w:rPr>
-          <w:rFonts w:ascii="Times New Roman" w:eastAsia="Times New Roman" w:hAnsi="Times New Roman" w:cs="Times New Roman"/>
-          <w:color w:val="000000"/>
-          <w:sz w:val="24"/>
-          <w:szCs w:val="24"/>
-          <w:lang w:val="en-GB"/>
-        </w:rPr>
-        <w:t xml:space="preserve">where a </w:t>
+        <w:t xml:space="preserve"/>
+      </w:r>
+      <w:r>
+        <w:rPr>
+          <w:rFonts w:ascii="Times New Roman" w:eastAsia="Times New Roman" w:hAnsi="Times New Roman" w:cs="Times New Roman"/>
+          <w:color w:val="000000"/>
+          <w:sz w:val="24"/>
+          <w:szCs w:val="24"/>
+          <w:lang w:val="en-GB"/>
+        </w:rPr>
+        <w:t xml:space="preserve"/>
       </w:r>
       <w:r>
         <w:rPr>
@@ -31128,17 +30998,17 @@
           <w:szCs w:val="24"/>
           <w:lang w:val="en-GB"/>
         </w:rPr>
-        <w:t xml:space="preserve">GitHub </w:t>
-      </w:r>
-      <w:r>
-        <w:rPr>
-          <w:rFonts w:ascii="Times New Roman" w:eastAsia="Times New Roman" w:hAnsi="Times New Roman" w:cs="Times New Roman"/>
-          <w:color w:val="000000"/>
-          <w:sz w:val="24"/>
-          <w:szCs w:val="24"/>
-          <w:lang w:val="en-GB"/>
-        </w:rPr>
-        <w:t xml:space="preserve">Actions workflow runs the checks, and can then be deployed to </w:t>
+        <w:t xml:space="preserve"/>
+      </w:r>
+      <w:r>
+        <w:rPr>
+          <w:rFonts w:ascii="Times New Roman" w:eastAsia="Times New Roman" w:hAnsi="Times New Roman" w:cs="Times New Roman"/>
+          <w:color w:val="000000"/>
+          <w:sz w:val="24"/>
+          <w:szCs w:val="24"/>
+          <w:lang w:val="en-GB"/>
+        </w:rPr>
+        <w:t xml:space="preserve"/>
       </w:r>
       <w:r>
         <w:rPr>
@@ -31149,7 +31019,7 @@
           <w:szCs w:val="24"/>
           <w:lang w:val="en-GB"/>
         </w:rPr>
-        <w:t>Vercel.</w:t>
+        <w:t xml:space="preserve"/>
       </w:r>
     </w:p>
     <w:p>
@@ -38215,7 +38085,7 @@
                 <w:szCs w:val="20"/>
                 <w:lang w:val="en-GB"/>
               </w:rPr>
-              <w:t xml:space="preserve">VS Code, Git, </w:t>
+              <w:t xml:space="preserve">VS Code, Git, GitHub, MongoDB Compass</w:t>
             </w:r>
             <w:r>
               <w:rPr>
@@ -38226,17 +38096,17 @@
                 <w:szCs w:val="20"/>
                 <w:lang w:val="en-GB"/>
               </w:rPr>
-              <w:t xml:space="preserve">GitHub, GitHub </w:t>
-            </w:r>
-            <w:r>
-              <w:rPr>
-                <w:rFonts w:ascii="Times New Roman" w:eastAsia="Times New Roman" w:hAnsi="Times New Roman" w:cs="Times New Roman"/>
-                <w:color w:val="000000"/>
-                <w:sz w:val="20"/>
-                <w:szCs w:val="20"/>
-                <w:lang w:val="en-GB"/>
-              </w:rPr>
-              <w:t xml:space="preserve">Actions, </w:t>
+              <w:t xml:space="preserve"/>
+            </w:r>
+            <w:r>
+              <w:rPr>
+                <w:rFonts w:ascii="Times New Roman" w:eastAsia="Times New Roman" w:hAnsi="Times New Roman" w:cs="Times New Roman"/>
+                <w:color w:val="000000"/>
+                <w:sz w:val="20"/>
+                <w:szCs w:val="20"/>
+                <w:lang w:val="en-GB"/>
+              </w:rPr>
+              <w:t xml:space="preserve"/>
             </w:r>
             <w:r>
               <w:rPr>
@@ -38247,17 +38117,17 @@
                 <w:szCs w:val="20"/>
                 <w:lang w:val="en-GB"/>
               </w:rPr>
-              <w:t xml:space="preserve">MongoDB </w:t>
-            </w:r>
-            <w:r>
-              <w:rPr>
-                <w:rFonts w:ascii="Times New Roman" w:eastAsia="Times New Roman" w:hAnsi="Times New Roman" w:cs="Times New Roman"/>
-                <w:color w:val="000000"/>
-                <w:sz w:val="20"/>
-                <w:szCs w:val="20"/>
-                <w:lang w:val="en-GB"/>
-              </w:rPr>
-              <w:t>Compass</w:t>
+              <w:t xml:space="preserve"/>
+            </w:r>
+            <w:r>
+              <w:rPr>
+                <w:rFonts w:ascii="Times New Roman" w:eastAsia="Times New Roman" w:hAnsi="Times New Roman" w:cs="Times New Roman"/>
+                <w:color w:val="000000"/>
+                <w:sz w:val="20"/>
+                <w:szCs w:val="20"/>
+                <w:lang w:val="en-GB"/>
+              </w:rPr>
+              <w:t xml:space="preserve"/>
             </w:r>
           </w:p>
         </w:tc>
@@ -39901,7 +39771,7 @@
           <w:szCs w:val="24"/>
           <w:lang w:val="en-GB"/>
         </w:rPr>
-        <w:t xml:space="preserve">A </w:t>
+        <w:t xml:space="preserve">Vercel builds the app before each deployment, so a version that does not build is never published.</w:t>
       </w:r>
       <w:r>
         <w:rPr>
@@ -39912,17 +39782,17 @@
           <w:szCs w:val="24"/>
           <w:lang w:val="en-GB"/>
         </w:rPr>
-        <w:t xml:space="preserve">GitHub </w:t>
-      </w:r>
-      <w:r>
-        <w:rPr>
-          <w:rFonts w:ascii="Times New Roman" w:eastAsia="Times New Roman" w:hAnsi="Times New Roman" w:cs="Times New Roman"/>
-          <w:color w:val="000000"/>
-          <w:sz w:val="24"/>
-          <w:szCs w:val="24"/>
-          <w:lang w:val="en-GB"/>
-        </w:rPr>
-        <w:t xml:space="preserve">Actions workflow provides continuous integration </w:t>
+        <w:t xml:space="preserve"/>
+      </w:r>
+      <w:r>
+        <w:rPr>
+          <w:rFonts w:ascii="Times New Roman" w:eastAsia="Times New Roman" w:hAnsi="Times New Roman" w:cs="Times New Roman"/>
+          <w:color w:val="000000"/>
+          <w:sz w:val="24"/>
+          <w:szCs w:val="24"/>
+          <w:lang w:val="en-GB"/>
+        </w:rPr>
+        <w:t xml:space="preserve"/>
       </w:r>
       <w:r>
         <w:rPr>
@@ -39933,17 +39803,17 @@
           <w:szCs w:val="24"/>
           <w:lang w:val="en-GB"/>
         </w:rPr>
-        <w:t xml:space="preserve">(CI): </w:t>
-      </w:r>
-      <w:r>
-        <w:rPr>
-          <w:rFonts w:ascii="Times New Roman" w:eastAsia="Times New Roman" w:hAnsi="Times New Roman" w:cs="Times New Roman"/>
-          <w:color w:val="000000"/>
-          <w:sz w:val="24"/>
-          <w:szCs w:val="24"/>
-          <w:lang w:val="en-GB"/>
-        </w:rPr>
-        <w:t xml:space="preserve">it runs </w:t>
+        <w:t xml:space="preserve"/>
+      </w:r>
+      <w:r>
+        <w:rPr>
+          <w:rFonts w:ascii="Times New Roman" w:eastAsia="Times New Roman" w:hAnsi="Times New Roman" w:cs="Times New Roman"/>
+          <w:color w:val="000000"/>
+          <w:sz w:val="24"/>
+          <w:szCs w:val="24"/>
+          <w:lang w:val="en-GB"/>
+        </w:rPr>
+        <w:t xml:space="preserve"/>
       </w:r>
       <w:r>
         <w:rPr>
@@ -39954,17 +39824,17 @@
           <w:szCs w:val="24"/>
           <w:lang w:val="en-GB"/>
         </w:rPr>
-        <w:t xml:space="preserve">lint </w:t>
-      </w:r>
-      <w:r>
-        <w:rPr>
-          <w:rFonts w:ascii="Times New Roman" w:eastAsia="Times New Roman" w:hAnsi="Times New Roman" w:cs="Times New Roman"/>
-          <w:color w:val="000000"/>
-          <w:sz w:val="24"/>
-          <w:szCs w:val="24"/>
-          <w:lang w:val="en-GB"/>
-        </w:rPr>
-        <w:t>and a build on every push.</w:t>
+        <w:t xml:space="preserve"/>
+      </w:r>
+      <w:r>
+        <w:rPr>
+          <w:rFonts w:ascii="Times New Roman" w:eastAsia="Times New Roman" w:hAnsi="Times New Roman" w:cs="Times New Roman"/>
+          <w:color w:val="000000"/>
+          <w:sz w:val="24"/>
+          <w:szCs w:val="24"/>
+          <w:lang w:val="en-GB"/>
+        </w:rPr>
+        <w:t xml:space="preserve"/>
       </w:r>
     </w:p>
     <w:p>
@@ -41070,7 +40940,7 @@
           <w:szCs w:val="24"/>
           <w:lang w:val="en-GB"/>
         </w:rPr>
-        <w:t xml:space="preserve">The team ran all 159 unit and database tests on their own computer, and all of them pass. A </w:t>
+        <w:t xml:space="preserve">The team ran all 159 unit and database tests on their own computer, and all of them pass. The code also passes lint and a production build.</w:t>
       </w:r>
       <w:r>
         <w:rPr>
@@ -41081,17 +40951,17 @@
           <w:szCs w:val="24"/>
           <w:lang w:val="en-GB"/>
         </w:rPr>
-        <w:t xml:space="preserve">GitHub </w:t>
-      </w:r>
-      <w:r>
-        <w:rPr>
-          <w:rFonts w:ascii="Times New Roman" w:eastAsia="Times New Roman" w:hAnsi="Times New Roman" w:cs="Times New Roman"/>
-          <w:color w:val="000000"/>
-          <w:sz w:val="24"/>
-          <w:szCs w:val="24"/>
-          <w:lang w:val="en-GB"/>
-        </w:rPr>
-        <w:t xml:space="preserve">Actions workflow runs </w:t>
+        <w:t xml:space="preserve"/>
+      </w:r>
+      <w:r>
+        <w:rPr>
+          <w:rFonts w:ascii="Times New Roman" w:eastAsia="Times New Roman" w:hAnsi="Times New Roman" w:cs="Times New Roman"/>
+          <w:color w:val="000000"/>
+          <w:sz w:val="24"/>
+          <w:szCs w:val="24"/>
+          <w:lang w:val="en-GB"/>
+        </w:rPr>
+        <w:t xml:space="preserve"/>
       </w:r>
       <w:r>
         <w:rPr>
@@ -41102,17 +40972,17 @@
           <w:szCs w:val="24"/>
           <w:lang w:val="en-GB"/>
         </w:rPr>
-        <w:t xml:space="preserve">lint </w:t>
-      </w:r>
-      <w:r>
-        <w:rPr>
-          <w:rFonts w:ascii="Times New Roman" w:eastAsia="Times New Roman" w:hAnsi="Times New Roman" w:cs="Times New Roman"/>
-          <w:color w:val="000000"/>
-          <w:sz w:val="24"/>
-          <w:szCs w:val="24"/>
-          <w:lang w:val="en-GB"/>
-        </w:rPr>
-        <w:t>and a production build on every push.</w:t>
+        <w:t xml:space="preserve"/>
+      </w:r>
+      <w:r>
+        <w:rPr>
+          <w:rFonts w:ascii="Times New Roman" w:eastAsia="Times New Roman" w:hAnsi="Times New Roman" w:cs="Times New Roman"/>
+          <w:color w:val="000000"/>
+          <w:sz w:val="24"/>
+          <w:szCs w:val="24"/>
+          <w:lang w:val="en-GB"/>
+        </w:rPr>
+        <w:t xml:space="preserve"/>
       </w:r>
     </w:p>
     <w:p>

</xml_diff>

<commit_message>
perf: cache public pages and route browser calls through React Query
- Add TanStack Query with one `apiRequest`/`useApiMutation` helper, so every form, button and poll shares one client and its busy state
- Cache the public sources, mentors and posts reads in `src/lib/cache.js` behind `cacheComponents`, and clear the tags from the routes that change them
- Replace `PageSkeleton` with a per-page skeleton kit, so each loading screen matches the page it stands in for instead of a generic outline
- Switch off every link outside the dashboard with `OffLink` and `lib/limited-mode.js`, keeping the submission build on one page
</commit_message>
<xml_diff>
--- a/docs/Project-Documentation.docx
+++ b/docs/Project-Documentation.docx
@@ -23718,17 +23718,17 @@
                 <w:szCs w:val="20"/>
                 <w:lang w:val="en-GB"/>
               </w:rPr>
-              <w:t xml:space="preserve">Next.js </w:t>
-            </w:r>
-            <w:r>
-              <w:rPr>
-                <w:rFonts w:ascii="Times New Roman" w:eastAsia="Times New Roman" w:hAnsi="Times New Roman" w:cs="Times New Roman"/>
-                <w:color w:val="000000"/>
-                <w:sz w:val="20"/>
-                <w:szCs w:val="20"/>
-                <w:lang w:val="en-GB"/>
-              </w:rPr>
-              <w:t xml:space="preserve">16 and </w:t>
+              <w:t xml:space="preserve">Next.js 16, React 19 and TanStack Query</w:t>
+            </w:r>
+            <w:r>
+              <w:rPr>
+                <w:rFonts w:ascii="Times New Roman" w:eastAsia="Times New Roman" w:hAnsi="Times New Roman" w:cs="Times New Roman"/>
+                <w:color w:val="000000"/>
+                <w:sz w:val="20"/>
+                <w:szCs w:val="20"/>
+                <w:lang w:val="en-GB"/>
+              </w:rPr>
+              <w:t xml:space="preserve"/>
             </w:r>
             <w:r>
               <w:rPr>
@@ -23739,17 +23739,17 @@
                 <w:szCs w:val="20"/>
                 <w:lang w:val="en-GB"/>
               </w:rPr>
-              <w:t xml:space="preserve">React </w:t>
-            </w:r>
-            <w:r>
-              <w:rPr>
-                <w:rFonts w:ascii="Times New Roman" w:eastAsia="Times New Roman" w:hAnsi="Times New Roman" w:cs="Times New Roman"/>
-                <w:color w:val="000000"/>
-                <w:sz w:val="20"/>
-                <w:szCs w:val="20"/>
-                <w:lang w:val="en-GB"/>
-              </w:rPr>
-              <w:t>19</w:t>
+              <w:t xml:space="preserve"/>
+            </w:r>
+            <w:r>
+              <w:rPr>
+                <w:rFonts w:ascii="Times New Roman" w:eastAsia="Times New Roman" w:hAnsi="Times New Roman" w:cs="Times New Roman"/>
+                <w:color w:val="000000"/>
+                <w:sz w:val="20"/>
+                <w:szCs w:val="20"/>
+                <w:lang w:val="en-GB"/>
+              </w:rPr>
+              <w:t xml:space="preserve"/>
             </w:r>
           </w:p>
         </w:tc>
@@ -23776,7 +23776,7 @@
                 <w:szCs w:val="20"/>
                 <w:lang w:val="en-GB"/>
               </w:rPr>
-              <w:t>Pages and server code in one project</w:t>
+              <w:t xml:space="preserve">Pages and server code in one project, and data loading in the browser</w:t>
             </w:r>
           </w:p>
         </w:tc>
@@ -38031,17 +38031,17 @@
                 <w:szCs w:val="20"/>
                 <w:lang w:val="en-GB"/>
               </w:rPr>
-              <w:t xml:space="preserve">Next.js </w:t>
-            </w:r>
-            <w:r>
-              <w:rPr>
-                <w:rFonts w:ascii="Times New Roman" w:eastAsia="Times New Roman" w:hAnsi="Times New Roman" w:cs="Times New Roman"/>
-                <w:color w:val="000000"/>
-                <w:sz w:val="20"/>
-                <w:szCs w:val="20"/>
-                <w:lang w:val="en-GB"/>
-              </w:rPr>
-              <w:t xml:space="preserve">16, </w:t>
+              <w:t xml:space="preserve">Next.js 16, React 19, TanStack Query, Tailwind CSS 4</w:t>
+            </w:r>
+            <w:r>
+              <w:rPr>
+                <w:rFonts w:ascii="Times New Roman" w:eastAsia="Times New Roman" w:hAnsi="Times New Roman" w:cs="Times New Roman"/>
+                <w:color w:val="000000"/>
+                <w:sz w:val="20"/>
+                <w:szCs w:val="20"/>
+                <w:lang w:val="en-GB"/>
+              </w:rPr>
+              <w:t xml:space="preserve"/>
             </w:r>
             <w:r>
               <w:rPr>
@@ -38052,17 +38052,17 @@
                 <w:szCs w:val="20"/>
                 <w:lang w:val="en-GB"/>
               </w:rPr>
-              <w:t xml:space="preserve">React </w:t>
-            </w:r>
-            <w:r>
-              <w:rPr>
-                <w:rFonts w:ascii="Times New Roman" w:eastAsia="Times New Roman" w:hAnsi="Times New Roman" w:cs="Times New Roman"/>
-                <w:color w:val="000000"/>
-                <w:sz w:val="20"/>
-                <w:szCs w:val="20"/>
-                <w:lang w:val="en-GB"/>
-              </w:rPr>
-              <w:t xml:space="preserve">19, </w:t>
+              <w:t xml:space="preserve"/>
+            </w:r>
+            <w:r>
+              <w:rPr>
+                <w:rFonts w:ascii="Times New Roman" w:eastAsia="Times New Roman" w:hAnsi="Times New Roman" w:cs="Times New Roman"/>
+                <w:color w:val="000000"/>
+                <w:sz w:val="20"/>
+                <w:szCs w:val="20"/>
+                <w:lang w:val="en-GB"/>
+              </w:rPr>
+              <w:t xml:space="preserve"/>
             </w:r>
             <w:r>
               <w:rPr>
@@ -38073,17 +38073,17 @@
                 <w:szCs w:val="20"/>
                 <w:lang w:val="en-GB"/>
               </w:rPr>
-              <w:t xml:space="preserve">Tailwind </w:t>
-            </w:r>
-            <w:r>
-              <w:rPr>
-                <w:rFonts w:ascii="Times New Roman" w:eastAsia="Times New Roman" w:hAnsi="Times New Roman" w:cs="Times New Roman"/>
-                <w:color w:val="000000"/>
-                <w:sz w:val="20"/>
-                <w:szCs w:val="20"/>
-                <w:lang w:val="en-GB"/>
-              </w:rPr>
-              <w:t>CSS 4</w:t>
+              <w:t xml:space="preserve"/>
+            </w:r>
+            <w:r>
+              <w:rPr>
+                <w:rFonts w:ascii="Times New Roman" w:eastAsia="Times New Roman" w:hAnsi="Times New Roman" w:cs="Times New Roman"/>
+                <w:color w:val="000000"/>
+                <w:sz w:val="20"/>
+                <w:szCs w:val="20"/>
+                <w:lang w:val="en-GB"/>
+              </w:rPr>
+              <w:t xml:space="preserve"/>
             </w:r>
           </w:p>
         </w:tc>

</xml_diff>